<commit_message>
docs: test plan and test design for FPTshop
</commit_message>
<xml_diff>
--- a/Tuan1/21130408_Srs.docx
+++ b/Tuan1/21130408_Srs.docx
@@ -2415,7 +2415,7 @@
           <w:noProof/>
         </w:rPr>
         <w:drawing>
-          <wp:inline distT="0" distB="0" distL="0" distR="0" wp14:anchorId="11B3C5C9" wp14:editId="2743D912">
+          <wp:inline distT="0" distB="0" distL="0" distR="0" wp14:anchorId="11B3C5C9" wp14:editId="5ECB5CD6">
             <wp:extent cx="5974080" cy="2903220"/>
             <wp:effectExtent l="0" t="0" r="0" b="0"/>
             <wp:docPr id="9" name="Picture 1"/>
@@ -2732,7 +2732,7 @@
           <w:noProof/>
         </w:rPr>
         <w:drawing>
-          <wp:inline distT="0" distB="0" distL="0" distR="0" wp14:anchorId="6DF2567F" wp14:editId="51B8528D">
+          <wp:inline distT="0" distB="0" distL="0" distR="0" wp14:anchorId="6DF2567F" wp14:editId="037C9E23">
             <wp:extent cx="5981700" cy="3253740"/>
             <wp:effectExtent l="0" t="0" r="0" b="0"/>
             <wp:docPr id="7" name="Picture 1"/>
@@ -2821,7 +2821,7 @@
           <w:noProof/>
         </w:rPr>
         <w:drawing>
-          <wp:inline distT="0" distB="0" distL="0" distR="0" wp14:anchorId="04ED3B67" wp14:editId="18DF832F">
+          <wp:inline distT="0" distB="0" distL="0" distR="0" wp14:anchorId="04ED3B67" wp14:editId="435A8A68">
             <wp:extent cx="5981700" cy="3345180"/>
             <wp:effectExtent l="0" t="0" r="0" b="0"/>
             <wp:docPr id="6" name="Picture 1"/>
@@ -2973,7 +2973,7 @@
           <w:noProof/>
         </w:rPr>
         <w:drawing>
-          <wp:inline distT="0" distB="0" distL="0" distR="0" wp14:anchorId="564D5D51" wp14:editId="4B911BAC">
+          <wp:inline distT="0" distB="0" distL="0" distR="0" wp14:anchorId="564D5D51" wp14:editId="3F6FE96B">
             <wp:extent cx="5974080" cy="3268980"/>
             <wp:effectExtent l="0" t="0" r="0" b="0"/>
             <wp:docPr id="54" name="Picture 1"/>
@@ -3107,7 +3107,7 @@
         </w:rPr>
         <w:lastRenderedPageBreak/>
         <w:drawing>
-          <wp:anchor distT="0" distB="0" distL="114300" distR="114300" simplePos="0" relativeHeight="251659264" behindDoc="0" locked="0" layoutInCell="1" allowOverlap="1" wp14:anchorId="14F81CE6" wp14:editId="65E2DEFA">
+          <wp:anchor distT="0" distB="0" distL="114300" distR="114300" simplePos="0" relativeHeight="251659264" behindDoc="0" locked="0" layoutInCell="1" allowOverlap="1" wp14:anchorId="14F81CE6" wp14:editId="6F1623FF">
             <wp:simplePos x="0" y="0"/>
             <wp:positionH relativeFrom="column">
               <wp:posOffset>-8890</wp:posOffset>
@@ -3236,7 +3236,7 @@
           <w:noProof/>
         </w:rPr>
         <w:drawing>
-          <wp:anchor distT="0" distB="0" distL="114300" distR="114300" simplePos="0" relativeHeight="251661312" behindDoc="0" locked="0" layoutInCell="1" allowOverlap="1" wp14:anchorId="29088E29" wp14:editId="11CFA468">
+          <wp:anchor distT="0" distB="0" distL="114300" distR="114300" simplePos="0" relativeHeight="251661312" behindDoc="0" locked="0" layoutInCell="1" allowOverlap="1" wp14:anchorId="29088E29" wp14:editId="49236CEA">
             <wp:simplePos x="0" y="0"/>
             <wp:positionH relativeFrom="column">
               <wp:posOffset>52070</wp:posOffset>
@@ -3586,9 +3586,9 @@
           </wp:inline>
         </w:drawing>
       </w:r>
+      <w:bookmarkEnd w:id="0"/>
+      <w:bookmarkEnd w:id="1"/>
     </w:p>
-    <w:bookmarkEnd w:id="0"/>
-    <w:bookmarkEnd w:id="1"/>
     <w:sectPr>
       <w:headerReference w:type="default" r:id="rId19"/>
       <w:footerReference w:type="even" r:id="rId20"/>
@@ -4415,7 +4415,7 @@
       <w:lvlJc w:val="left"/>
       <w:pPr>
         <w:tabs>
-          <w:tab w:val="num" w:pos="0"/>
+          <w:tab w:val="num" w:pos="142"/>
         </w:tabs>
       </w:pPr>
       <w:rPr>
@@ -8897,7 +8897,7 @@
         <w:numId w:val="4"/>
       </w:numPr>
       <w:tabs>
-        <w:tab w:val="clear" w:pos="0"/>
+        <w:tab w:val="clear" w:pos="142"/>
         <w:tab w:val="num" w:pos="454"/>
       </w:tabs>
       <w:spacing w:before="120" w:after="60" w:line="320" w:lineRule="exact"/>
@@ -9096,7 +9096,6 @@
     <w:uiPriority w:val="99"/>
     <w:semiHidden/>
     <w:unhideWhenUsed/>
-    <w:qFormat/>
     <w:tblPr>
       <w:tblInd w:w="0" w:type="dxa"/>
       <w:tblCellMar>
@@ -9115,7 +9114,6 @@
   </w:style>
   <w:style w:type="character" w:customStyle="1" w:styleId="Heading1Char">
     <w:name w:val="Heading 1 Char"/>
-    <w:link w:val="Heading1"/>
     <w:uiPriority w:val="99"/>
     <w:locked/>
     <w:rsid w:val="0056457A"/>
@@ -9131,7 +9129,6 @@
   </w:style>
   <w:style w:type="character" w:customStyle="1" w:styleId="Heading2Char">
     <w:name w:val="Heading 2 Char"/>
-    <w:link w:val="Heading2"/>
     <w:uiPriority w:val="99"/>
     <w:semiHidden/>
     <w:locked/>
@@ -9149,7 +9146,6 @@
   </w:style>
   <w:style w:type="character" w:customStyle="1" w:styleId="Heading3Char">
     <w:name w:val="Heading 3 Char"/>
-    <w:link w:val="Heading3"/>
     <w:uiPriority w:val="99"/>
     <w:semiHidden/>
     <w:locked/>
@@ -9165,7 +9161,6 @@
   </w:style>
   <w:style w:type="character" w:customStyle="1" w:styleId="Heading4Char">
     <w:name w:val="Heading 4 Char"/>
-    <w:link w:val="Heading4"/>
     <w:uiPriority w:val="99"/>
     <w:semiHidden/>
     <w:locked/>
@@ -9181,7 +9176,6 @@
   </w:style>
   <w:style w:type="character" w:customStyle="1" w:styleId="Heading5Char">
     <w:name w:val="Heading 5 Char"/>
-    <w:link w:val="Heading5"/>
     <w:uiPriority w:val="99"/>
     <w:semiHidden/>
     <w:locked/>
@@ -9199,7 +9193,6 @@
   </w:style>
   <w:style w:type="character" w:customStyle="1" w:styleId="Heading6Char">
     <w:name w:val="Heading 6 Char"/>
-    <w:link w:val="Heading6"/>
     <w:uiPriority w:val="99"/>
     <w:semiHidden/>
     <w:locked/>
@@ -9213,7 +9206,6 @@
   </w:style>
   <w:style w:type="character" w:customStyle="1" w:styleId="Heading7Char">
     <w:name w:val="Heading 7 Char"/>
-    <w:link w:val="Heading7"/>
     <w:uiPriority w:val="99"/>
     <w:semiHidden/>
     <w:locked/>
@@ -9227,7 +9219,6 @@
   </w:style>
   <w:style w:type="character" w:customStyle="1" w:styleId="Heading8Char">
     <w:name w:val="Heading 8 Char"/>
-    <w:link w:val="Heading8"/>
     <w:uiPriority w:val="99"/>
     <w:semiHidden/>
     <w:locked/>
@@ -9243,7 +9234,6 @@
   </w:style>
   <w:style w:type="character" w:customStyle="1" w:styleId="Heading9Char">
     <w:name w:val="Heading 9 Char"/>
-    <w:link w:val="Heading9"/>
     <w:uiPriority w:val="99"/>
     <w:semiHidden/>
     <w:locked/>
@@ -9390,7 +9380,6 @@
   </w:style>
   <w:style w:type="character" w:customStyle="1" w:styleId="BodyText2Char">
     <w:name w:val="Body Text 2 Char"/>
-    <w:link w:val="BodyText2"/>
     <w:uiPriority w:val="99"/>
     <w:semiHidden/>
     <w:locked/>
@@ -9427,7 +9416,6 @@
   </w:style>
   <w:style w:type="character" w:customStyle="1" w:styleId="HeaderChar">
     <w:name w:val="Header Char"/>
-    <w:link w:val="Header"/>
     <w:uiPriority w:val="99"/>
     <w:semiHidden/>
     <w:locked/>
@@ -9468,7 +9456,6 @@
   </w:style>
   <w:style w:type="character" w:customStyle="1" w:styleId="FooterChar">
     <w:name w:val="Footer Char"/>
-    <w:link w:val="Footer"/>
     <w:uiPriority w:val="99"/>
     <w:semiHidden/>
     <w:locked/>
@@ -9601,7 +9588,6 @@
   </w:style>
   <w:style w:type="character" w:customStyle="1" w:styleId="BodyText3Char">
     <w:name w:val="Body Text 3 Char"/>
-    <w:link w:val="BodyText3"/>
     <w:uiPriority w:val="99"/>
     <w:semiHidden/>
     <w:locked/>
@@ -9646,7 +9632,6 @@
   </w:style>
   <w:style w:type="character" w:customStyle="1" w:styleId="BodyTextChar">
     <w:name w:val="Body Text Char"/>
-    <w:link w:val="BodyText"/>
     <w:uiPriority w:val="99"/>
     <w:semiHidden/>
     <w:locked/>
@@ -9686,7 +9671,6 @@
   </w:style>
   <w:style w:type="character" w:customStyle="1" w:styleId="BodyTextIndentChar">
     <w:name w:val="Body Text Indent Char"/>
-    <w:link w:val="BodyTextIndent"/>
     <w:uiPriority w:val="99"/>
     <w:semiHidden/>
     <w:locked/>
@@ -9731,8 +9715,8 @@
       <w:rFonts w:cs="Tahoma"/>
     </w:rPr>
   </w:style>
-  <w:style w:type="paragraph" w:customStyle="1" w:styleId="bodytext0">
-    <w:name w:val="body text"/>
+  <w:style w:type="paragraph" w:customStyle="1" w:styleId="BodyText10">
+    <w:name w:val="Body Text1"/>
     <w:uiPriority w:val="99"/>
     <w:rsid w:val="00286CAE"/>
     <w:pPr>
@@ -9778,7 +9762,6 @@
   </w:style>
   <w:style w:type="character" w:customStyle="1" w:styleId="TitleChar">
     <w:name w:val="Title Char"/>
-    <w:link w:val="Title"/>
     <w:uiPriority w:val="99"/>
     <w:locked/>
     <w:rsid w:val="0056457A"/>
@@ -9845,7 +9828,6 @@
   </w:style>
   <w:style w:type="character" w:customStyle="1" w:styleId="DocumentMapChar">
     <w:name w:val="Document Map Char"/>
-    <w:link w:val="DocumentMap"/>
     <w:uiPriority w:val="99"/>
     <w:semiHidden/>
     <w:locked/>
@@ -10025,7 +10007,6 @@
   </w:style>
   <w:style w:type="character" w:customStyle="1" w:styleId="BalloonTextChar">
     <w:name w:val="Balloon Text Char"/>
-    <w:link w:val="BalloonText"/>
     <w:uiPriority w:val="99"/>
     <w:semiHidden/>
     <w:locked/>

</xml_diff>